<commit_message>
Increase pump priming coreh in line with Cirrus expansion
</commit_message>
<xml_diff>
--- a/content/support-access/access/Cirrus-TA-PumpPriming-form.docx
+++ b/content/support-access/access/Cirrus-TA-PumpPriming-form.docx
@@ -1,6 +1,6 @@
 
 <file path=word/document.xml><?xml version="1.0" encoding="utf-8"?>
-<w:document xmlns:wpc="http://schemas.microsoft.com/office/word/2010/wordprocessingCanvas" xmlns:cx="http://schemas.microsoft.com/office/drawing/2014/chartex" xmlns:cx1="http://schemas.microsoft.com/office/drawing/2015/9/8/chartex" xmlns:cx2="http://schemas.microsoft.com/office/drawing/2015/10/21/chartex" xmlns:cx3="http://schemas.microsoft.com/office/drawing/2016/5/9/chartex" xmlns:cx4="http://schemas.microsoft.com/office/drawing/2016/5/10/chartex" xmlns:cx5="http://schemas.microsoft.com/office/drawing/2016/5/11/chartex" xmlns:cx6="http://schemas.microsoft.com/office/drawing/2016/5/12/chartex" xmlns:cx7="http://schemas.microsoft.com/office/drawing/2016/5/13/chartex" xmlns:cx8="http://schemas.microsoft.com/office/drawing/2016/5/14/chartex" xmlns:mc="http://schemas.openxmlformats.org/markup-compatibility/2006" xmlns:aink="http://schemas.microsoft.com/office/drawing/2016/ink" xmlns:am3d="http://schemas.microsoft.com/office/drawing/2017/model3d" xmlns:o="urn:schemas-microsoft-com:office:office" xmlns:oel="http://schemas.microsoft.com/office/2019/extlst" xmlns:r="http://schemas.openxmlformats.org/officeDocument/2006/relationships" xmlns:m="http://schemas.openxmlformats.org/officeDocument/2006/math" xmlns:v="urn:schemas-microsoft-com:vml" xmlns:wp14="http://schemas.microsoft.com/office/word/2010/wordprocessingDrawing" xmlns:wp="http://schemas.openxmlformats.org/drawingml/2006/wordprocessingDrawing" xmlns:w10="urn:schemas-microsoft-com:office:word" xmlns:w="http://schemas.openxmlformats.org/wordprocessingml/2006/main" xmlns:w14="http://schemas.microsoft.com/office/word/2010/wordml" xmlns:w15="http://schemas.microsoft.com/office/word/2012/wordml" xmlns:w16cex="http://schemas.microsoft.com/office/word/2018/wordml/cex" xmlns:w16cid="http://schemas.microsoft.com/office/word/2016/wordml/cid" xmlns:w16="http://schemas.microsoft.com/office/word/2018/wordml" xmlns:w16du="http://schemas.microsoft.com/office/word/2023/wordml/word16du" xmlns:w16sdtdh="http://schemas.microsoft.com/office/word/2020/wordml/sdtdatahash" xmlns:w16sdtfl="http://schemas.microsoft.com/office/word/2024/wordml/sdtformatlock" xmlns:w16se="http://schemas.microsoft.com/office/word/2015/wordml/symex" xmlns:wpg="http://schemas.microsoft.com/office/word/2010/wordprocessingGroup" xmlns:wpi="http://schemas.microsoft.com/office/word/2010/wordprocessingInk" xmlns:wne="http://schemas.microsoft.com/office/word/2006/wordml" xmlns:wps="http://schemas.microsoft.com/office/word/2010/wordprocessingShape" mc:Ignorable="w14 w15 w16se w16cid w16 w16cex w16sdtdh w16sdtfl w16du wp14">
+<w:document xmlns:wpc="http://schemas.microsoft.com/office/word/2010/wordprocessingCanvas" xmlns:cx="http://schemas.microsoft.com/office/drawing/2014/chartex" xmlns:cx1="http://schemas.microsoft.com/office/drawing/2015/9/8/chartex" xmlns:cx2="http://schemas.microsoft.com/office/drawing/2015/10/21/chartex" xmlns:cx3="http://schemas.microsoft.com/office/drawing/2016/5/9/chartex" xmlns:cx4="http://schemas.microsoft.com/office/drawing/2016/5/10/chartex" xmlns:cx5="http://schemas.microsoft.com/office/drawing/2016/5/11/chartex" xmlns:cx6="http://schemas.microsoft.com/office/drawing/2016/5/12/chartex" xmlns:cx7="http://schemas.microsoft.com/office/drawing/2016/5/13/chartex" xmlns:cx8="http://schemas.microsoft.com/office/drawing/2016/5/14/chartex" xmlns:mc="http://schemas.openxmlformats.org/markup-compatibility/2006" xmlns:m="http://schemas.openxmlformats.org/officeDocument/2006/math" xmlns:aink="http://schemas.microsoft.com/office/drawing/2016/ink" xmlns:am3d="http://schemas.microsoft.com/office/drawing/2017/model3d" xmlns:oel="http://schemas.microsoft.com/office/2019/extlst" xmlns:r="http://schemas.openxmlformats.org/officeDocument/2006/relationships" xmlns:wp14="http://schemas.microsoft.com/office/word/2010/wordprocessingDrawing" xmlns:wp="http://schemas.openxmlformats.org/drawingml/2006/wordprocessingDrawing" xmlns:wpg="http://schemas.microsoft.com/office/word/2010/wordprocessingGroup" xmlns:wpi="http://schemas.microsoft.com/office/word/2010/wordprocessingInk" xmlns:wps="http://schemas.microsoft.com/office/word/2010/wordprocessingShape" xmlns:o="urn:schemas-microsoft-com:office:office" xmlns:v="urn:schemas-microsoft-com:vml" xmlns:w10="urn:schemas-microsoft-com:office:word" xmlns:w="http://schemas.openxmlformats.org/wordprocessingml/2006/main" xmlns:w14="http://schemas.microsoft.com/office/word/2010/wordml" xmlns:w15="http://schemas.microsoft.com/office/word/2012/wordml" xmlns:w16cex="http://schemas.microsoft.com/office/word/2018/wordml/cex" xmlns:w16cid="http://schemas.microsoft.com/office/word/2016/wordml/cid" xmlns:w16="http://schemas.microsoft.com/office/word/2018/wordml" xmlns:w16sdtdh="http://schemas.microsoft.com/office/word/2020/wordml/sdtdatahash" xmlns:w16sdtfl="http://schemas.microsoft.com/office/word/2024/wordml/sdtformatlock" xmlns:w16se="http://schemas.microsoft.com/office/word/2015/wordml/symex" xmlns:w16du="http://schemas.microsoft.com/office/word/2023/wordml/word16du" xmlns:wne="http://schemas.microsoft.com/office/word/2006/wordml" mc:Ignorable="w14 w15 w16se w16cid w16 w16cex w16sdtdh w16sdtfl w16du wp14">
   <w:background w:color="C6D9F1" w:themeColor="text2" w:themeTint="33"/>
   <w:body>
     <w:p>
@@ -91,7 +91,7 @@
                         <a:effectLst/>
                         <a:extLst>
                           <a:ext uri="{C572A759-6A51-4108-AA02-DFA0A04FC94B}">
-                            <ma14:wrappingTextBoxFlag xmlns="" xmlns:mo="http://schemas.microsoft.com/office/mac/office/2008/main" xmlns:mv="urn:schemas-microsoft-com:mac:vml" xmlns:o="urn:schemas-microsoft-com:office:office" xmlns:v="urn:schemas-microsoft-com:vml" xmlns:w10="urn:schemas-microsoft-com:office:word" xmlns:w="http://schemas.openxmlformats.org/wordprocessingml/2006/main" xmlns:ma14="http://schemas.microsoft.com/office/mac/drawingml/2011/main"/>
+                            <ma14:wrappingTextBoxFlag xmlns:ma14="http://schemas.microsoft.com/office/mac/drawingml/2011/main" xmlns:w="http://schemas.openxmlformats.org/wordprocessingml/2006/main" xmlns:w10="urn:schemas-microsoft-com:office:word" xmlns:v="urn:schemas-microsoft-com:vml" xmlns:o="urn:schemas-microsoft-com:office:office" xmlns:mv="urn:schemas-microsoft-com:mac:vml" xmlns:mo="http://schemas.microsoft.com/office/mac/office/2008/main" xmlns=""/>
                           </a:ext>
                         </a:extLst>
                       </wps:spPr>
@@ -597,13 +597,7 @@
         <w:rPr>
           <w:rFonts w:asciiTheme="minorHAnsi" w:hAnsiTheme="minorHAnsi"/>
         </w:rPr>
-        <w:t>8</w:t>
-      </w:r>
-      <w:r>
-        <w:rPr>
-          <w:rFonts w:asciiTheme="minorHAnsi" w:hAnsiTheme="minorHAnsi"/>
-        </w:rPr>
-        <w:t>0</w:t>
+        <w:t>200</w:t>
       </w:r>
       <w:r>
         <w:rPr>
@@ -2910,13 +2904,7 @@
         <w:rPr>
           <w:rFonts w:asciiTheme="minorHAnsi" w:hAnsiTheme="minorHAnsi" w:cs="Arial"/>
         </w:rPr>
-        <w:t>8</w:t>
-      </w:r>
-      <w:r>
-        <w:rPr>
-          <w:rFonts w:asciiTheme="minorHAnsi" w:hAnsiTheme="minorHAnsi" w:cs="Arial"/>
-        </w:rPr>
-        <w:t>0</w:t>
+        <w:t>200</w:t>
       </w:r>
       <w:r>
         <w:rPr>
@@ -3168,7 +3156,19 @@
         <w:rPr>
           <w:rFonts w:asciiTheme="minorHAnsi" w:hAnsiTheme="minorHAnsi" w:cs="Arial"/>
         </w:rPr>
-        <w:t xml:space="preserve"> GiB of disk space. If you require more than this you should specify this here and justify t</w:t>
+        <w:t xml:space="preserve"> GiB of disk space. If you require more than this</w:t>
+      </w:r>
+      <w:r>
+        <w:rPr>
+          <w:rFonts w:asciiTheme="minorHAnsi" w:hAnsiTheme="minorHAnsi" w:cs="Arial"/>
+        </w:rPr>
+        <w:t>,</w:t>
+      </w:r>
+      <w:r>
+        <w:rPr>
+          <w:rFonts w:asciiTheme="minorHAnsi" w:hAnsiTheme="minorHAnsi" w:cs="Arial"/>
+        </w:rPr>
+        <w:t xml:space="preserve"> you should specify this here and justify t</w:t>
       </w:r>
       <w:r>
         <w:rPr>
@@ -4640,7 +4640,7 @@
 </file>
 
 <file path=word/endnotes.xml><?xml version="1.0" encoding="utf-8"?>
-<w:endnotes xmlns:wpc="http://schemas.microsoft.com/office/word/2010/wordprocessingCanvas" xmlns:cx="http://schemas.microsoft.com/office/drawing/2014/chartex" xmlns:cx1="http://schemas.microsoft.com/office/drawing/2015/9/8/chartex" xmlns:cx2="http://schemas.microsoft.com/office/drawing/2015/10/21/chartex" xmlns:cx3="http://schemas.microsoft.com/office/drawing/2016/5/9/chartex" xmlns:cx4="http://schemas.microsoft.com/office/drawing/2016/5/10/chartex" xmlns:cx5="http://schemas.microsoft.com/office/drawing/2016/5/11/chartex" xmlns:cx6="http://schemas.microsoft.com/office/drawing/2016/5/12/chartex" xmlns:cx7="http://schemas.microsoft.com/office/drawing/2016/5/13/chartex" xmlns:cx8="http://schemas.microsoft.com/office/drawing/2016/5/14/chartex" xmlns:mc="http://schemas.openxmlformats.org/markup-compatibility/2006" xmlns:aink="http://schemas.microsoft.com/office/drawing/2016/ink" xmlns:am3d="http://schemas.microsoft.com/office/drawing/2017/model3d" xmlns:o="urn:schemas-microsoft-com:office:office" xmlns:oel="http://schemas.microsoft.com/office/2019/extlst" xmlns:r="http://schemas.openxmlformats.org/officeDocument/2006/relationships" xmlns:m="http://schemas.openxmlformats.org/officeDocument/2006/math" xmlns:v="urn:schemas-microsoft-com:vml" xmlns:wp14="http://schemas.microsoft.com/office/word/2010/wordprocessingDrawing" xmlns:wp="http://schemas.openxmlformats.org/drawingml/2006/wordprocessingDrawing" xmlns:w10="urn:schemas-microsoft-com:office:word" xmlns:w="http://schemas.openxmlformats.org/wordprocessingml/2006/main" xmlns:w14="http://schemas.microsoft.com/office/word/2010/wordml" xmlns:w15="http://schemas.microsoft.com/office/word/2012/wordml" xmlns:w16cex="http://schemas.microsoft.com/office/word/2018/wordml/cex" xmlns:w16cid="http://schemas.microsoft.com/office/word/2016/wordml/cid" xmlns:w16="http://schemas.microsoft.com/office/word/2018/wordml" xmlns:w16du="http://schemas.microsoft.com/office/word/2023/wordml/word16du" xmlns:w16sdtdh="http://schemas.microsoft.com/office/word/2020/wordml/sdtdatahash" xmlns:w16sdtfl="http://schemas.microsoft.com/office/word/2024/wordml/sdtformatlock" xmlns:w16se="http://schemas.microsoft.com/office/word/2015/wordml/symex" xmlns:wpg="http://schemas.microsoft.com/office/word/2010/wordprocessingGroup" xmlns:wpi="http://schemas.microsoft.com/office/word/2010/wordprocessingInk" xmlns:wne="http://schemas.microsoft.com/office/word/2006/wordml" xmlns:wps="http://schemas.microsoft.com/office/word/2010/wordprocessingShape" mc:Ignorable="w14 w15 w16se w16cid w16 w16cex w16sdtdh w16sdtfl w16du wp14">
+<w:endnotes xmlns:wpc="http://schemas.microsoft.com/office/word/2010/wordprocessingCanvas" xmlns:cx="http://schemas.microsoft.com/office/drawing/2014/chartex" xmlns:cx1="http://schemas.microsoft.com/office/drawing/2015/9/8/chartex" xmlns:cx2="http://schemas.microsoft.com/office/drawing/2015/10/21/chartex" xmlns:cx3="http://schemas.microsoft.com/office/drawing/2016/5/9/chartex" xmlns:cx4="http://schemas.microsoft.com/office/drawing/2016/5/10/chartex" xmlns:cx5="http://schemas.microsoft.com/office/drawing/2016/5/11/chartex" xmlns:cx6="http://schemas.microsoft.com/office/drawing/2016/5/12/chartex" xmlns:cx7="http://schemas.microsoft.com/office/drawing/2016/5/13/chartex" xmlns:cx8="http://schemas.microsoft.com/office/drawing/2016/5/14/chartex" xmlns:mc="http://schemas.openxmlformats.org/markup-compatibility/2006" xmlns:m="http://schemas.openxmlformats.org/officeDocument/2006/math" xmlns:aink="http://schemas.microsoft.com/office/drawing/2016/ink" xmlns:am3d="http://schemas.microsoft.com/office/drawing/2017/model3d" xmlns:oel="http://schemas.microsoft.com/office/2019/extlst" xmlns:r="http://schemas.openxmlformats.org/officeDocument/2006/relationships" xmlns:wp14="http://schemas.microsoft.com/office/word/2010/wordprocessingDrawing" xmlns:wp="http://schemas.openxmlformats.org/drawingml/2006/wordprocessingDrawing" xmlns:wpg="http://schemas.microsoft.com/office/word/2010/wordprocessingGroup" xmlns:wpi="http://schemas.microsoft.com/office/word/2010/wordprocessingInk" xmlns:wps="http://schemas.microsoft.com/office/word/2010/wordprocessingShape" xmlns:o="urn:schemas-microsoft-com:office:office" xmlns:v="urn:schemas-microsoft-com:vml" xmlns:w10="urn:schemas-microsoft-com:office:word" xmlns:w="http://schemas.openxmlformats.org/wordprocessingml/2006/main" xmlns:w14="http://schemas.microsoft.com/office/word/2010/wordml" xmlns:w15="http://schemas.microsoft.com/office/word/2012/wordml" xmlns:w16cex="http://schemas.microsoft.com/office/word/2018/wordml/cex" xmlns:w16cid="http://schemas.microsoft.com/office/word/2016/wordml/cid" xmlns:w16="http://schemas.microsoft.com/office/word/2018/wordml" xmlns:w16sdtdh="http://schemas.microsoft.com/office/word/2020/wordml/sdtdatahash" xmlns:w16sdtfl="http://schemas.microsoft.com/office/word/2024/wordml/sdtformatlock" xmlns:w16se="http://schemas.microsoft.com/office/word/2015/wordml/symex" xmlns:w16du="http://schemas.microsoft.com/office/word/2023/wordml/word16du" xmlns:wne="http://schemas.microsoft.com/office/word/2006/wordml" mc:Ignorable="w14 w15 w16se w16cid w16 w16cex w16sdtdh w16sdtfl w16du wp14">
   <w:endnote w:type="separator" w:id="-1">
     <w:p>
       <w:r>
@@ -4659,7 +4659,7 @@
 </file>
 
 <file path=word/footer1.xml><?xml version="1.0" encoding="utf-8"?>
-<w:ftr xmlns:wpc="http://schemas.microsoft.com/office/word/2010/wordprocessingCanvas" xmlns:cx="http://schemas.microsoft.com/office/drawing/2014/chartex" xmlns:cx1="http://schemas.microsoft.com/office/drawing/2015/9/8/chartex" xmlns:cx2="http://schemas.microsoft.com/office/drawing/2015/10/21/chartex" xmlns:cx3="http://schemas.microsoft.com/office/drawing/2016/5/9/chartex" xmlns:cx4="http://schemas.microsoft.com/office/drawing/2016/5/10/chartex" xmlns:cx5="http://schemas.microsoft.com/office/drawing/2016/5/11/chartex" xmlns:cx6="http://schemas.microsoft.com/office/drawing/2016/5/12/chartex" xmlns:cx7="http://schemas.microsoft.com/office/drawing/2016/5/13/chartex" xmlns:cx8="http://schemas.microsoft.com/office/drawing/2016/5/14/chartex" xmlns:mc="http://schemas.openxmlformats.org/markup-compatibility/2006" xmlns:aink="http://schemas.microsoft.com/office/drawing/2016/ink" xmlns:am3d="http://schemas.microsoft.com/office/drawing/2017/model3d" xmlns:o="urn:schemas-microsoft-com:office:office" xmlns:oel="http://schemas.microsoft.com/office/2019/extlst" xmlns:r="http://schemas.openxmlformats.org/officeDocument/2006/relationships" xmlns:m="http://schemas.openxmlformats.org/officeDocument/2006/math" xmlns:v="urn:schemas-microsoft-com:vml" xmlns:wp14="http://schemas.microsoft.com/office/word/2010/wordprocessingDrawing" xmlns:wp="http://schemas.openxmlformats.org/drawingml/2006/wordprocessingDrawing" xmlns:w10="urn:schemas-microsoft-com:office:word" xmlns:w="http://schemas.openxmlformats.org/wordprocessingml/2006/main" xmlns:w14="http://schemas.microsoft.com/office/word/2010/wordml" xmlns:w15="http://schemas.microsoft.com/office/word/2012/wordml" xmlns:w16cex="http://schemas.microsoft.com/office/word/2018/wordml/cex" xmlns:w16cid="http://schemas.microsoft.com/office/word/2016/wordml/cid" xmlns:w16="http://schemas.microsoft.com/office/word/2018/wordml" xmlns:w16du="http://schemas.microsoft.com/office/word/2023/wordml/word16du" xmlns:w16sdtdh="http://schemas.microsoft.com/office/word/2020/wordml/sdtdatahash" xmlns:w16sdtfl="http://schemas.microsoft.com/office/word/2024/wordml/sdtformatlock" xmlns:w16se="http://schemas.microsoft.com/office/word/2015/wordml/symex" xmlns:wpg="http://schemas.microsoft.com/office/word/2010/wordprocessingGroup" xmlns:wpi="http://schemas.microsoft.com/office/word/2010/wordprocessingInk" xmlns:wne="http://schemas.microsoft.com/office/word/2006/wordml" xmlns:wps="http://schemas.microsoft.com/office/word/2010/wordprocessingShape" mc:Ignorable="w14 w15 w16se w16cid w16 w16cex w16sdtdh w16sdtfl w16du wp14">
+<w:ftr xmlns:wpc="http://schemas.microsoft.com/office/word/2010/wordprocessingCanvas" xmlns:cx="http://schemas.microsoft.com/office/drawing/2014/chartex" xmlns:cx1="http://schemas.microsoft.com/office/drawing/2015/9/8/chartex" xmlns:cx2="http://schemas.microsoft.com/office/drawing/2015/10/21/chartex" xmlns:cx3="http://schemas.microsoft.com/office/drawing/2016/5/9/chartex" xmlns:cx4="http://schemas.microsoft.com/office/drawing/2016/5/10/chartex" xmlns:cx5="http://schemas.microsoft.com/office/drawing/2016/5/11/chartex" xmlns:cx6="http://schemas.microsoft.com/office/drawing/2016/5/12/chartex" xmlns:cx7="http://schemas.microsoft.com/office/drawing/2016/5/13/chartex" xmlns:cx8="http://schemas.microsoft.com/office/drawing/2016/5/14/chartex" xmlns:mc="http://schemas.openxmlformats.org/markup-compatibility/2006" xmlns:m="http://schemas.openxmlformats.org/officeDocument/2006/math" xmlns:aink="http://schemas.microsoft.com/office/drawing/2016/ink" xmlns:am3d="http://schemas.microsoft.com/office/drawing/2017/model3d" xmlns:oel="http://schemas.microsoft.com/office/2019/extlst" xmlns:r="http://schemas.openxmlformats.org/officeDocument/2006/relationships" xmlns:wp14="http://schemas.microsoft.com/office/word/2010/wordprocessingDrawing" xmlns:wp="http://schemas.openxmlformats.org/drawingml/2006/wordprocessingDrawing" xmlns:wpg="http://schemas.microsoft.com/office/word/2010/wordprocessingGroup" xmlns:wpi="http://schemas.microsoft.com/office/word/2010/wordprocessingInk" xmlns:wps="http://schemas.microsoft.com/office/word/2010/wordprocessingShape" xmlns:o="urn:schemas-microsoft-com:office:office" xmlns:v="urn:schemas-microsoft-com:vml" xmlns:w10="urn:schemas-microsoft-com:office:word" xmlns:w="http://schemas.openxmlformats.org/wordprocessingml/2006/main" xmlns:w14="http://schemas.microsoft.com/office/word/2010/wordml" xmlns:w15="http://schemas.microsoft.com/office/word/2012/wordml" xmlns:w16cex="http://schemas.microsoft.com/office/word/2018/wordml/cex" xmlns:w16cid="http://schemas.microsoft.com/office/word/2016/wordml/cid" xmlns:w16="http://schemas.microsoft.com/office/word/2018/wordml" xmlns:w16sdtdh="http://schemas.microsoft.com/office/word/2020/wordml/sdtdatahash" xmlns:w16sdtfl="http://schemas.microsoft.com/office/word/2024/wordml/sdtformatlock" xmlns:w16se="http://schemas.microsoft.com/office/word/2015/wordml/symex" xmlns:w16du="http://schemas.microsoft.com/office/word/2023/wordml/word16du" xmlns:wne="http://schemas.microsoft.com/office/word/2006/wordml" mc:Ignorable="w14 w15 w16se w16cid w16 w16cex w16sdtdh w16sdtfl w16du wp14">
   <w:p>
     <w:pPr>
       <w:pStyle w:val="Footer"/>
@@ -4669,7 +4669,7 @@
 </file>
 
 <file path=word/footer2.xml><?xml version="1.0" encoding="utf-8"?>
-<w:ftr xmlns:wpc="http://schemas.microsoft.com/office/word/2010/wordprocessingCanvas" xmlns:cx="http://schemas.microsoft.com/office/drawing/2014/chartex" xmlns:cx1="http://schemas.microsoft.com/office/drawing/2015/9/8/chartex" xmlns:cx2="http://schemas.microsoft.com/office/drawing/2015/10/21/chartex" xmlns:cx3="http://schemas.microsoft.com/office/drawing/2016/5/9/chartex" xmlns:cx4="http://schemas.microsoft.com/office/drawing/2016/5/10/chartex" xmlns:cx5="http://schemas.microsoft.com/office/drawing/2016/5/11/chartex" xmlns:cx6="http://schemas.microsoft.com/office/drawing/2016/5/12/chartex" xmlns:cx7="http://schemas.microsoft.com/office/drawing/2016/5/13/chartex" xmlns:cx8="http://schemas.microsoft.com/office/drawing/2016/5/14/chartex" xmlns:mc="http://schemas.openxmlformats.org/markup-compatibility/2006" xmlns:aink="http://schemas.microsoft.com/office/drawing/2016/ink" xmlns:am3d="http://schemas.microsoft.com/office/drawing/2017/model3d" xmlns:o="urn:schemas-microsoft-com:office:office" xmlns:oel="http://schemas.microsoft.com/office/2019/extlst" xmlns:r="http://schemas.openxmlformats.org/officeDocument/2006/relationships" xmlns:m="http://schemas.openxmlformats.org/officeDocument/2006/math" xmlns:v="urn:schemas-microsoft-com:vml" xmlns:wp14="http://schemas.microsoft.com/office/word/2010/wordprocessingDrawing" xmlns:wp="http://schemas.openxmlformats.org/drawingml/2006/wordprocessingDrawing" xmlns:w10="urn:schemas-microsoft-com:office:word" xmlns:w="http://schemas.openxmlformats.org/wordprocessingml/2006/main" xmlns:w14="http://schemas.microsoft.com/office/word/2010/wordml" xmlns:w15="http://schemas.microsoft.com/office/word/2012/wordml" xmlns:w16cex="http://schemas.microsoft.com/office/word/2018/wordml/cex" xmlns:w16cid="http://schemas.microsoft.com/office/word/2016/wordml/cid" xmlns:w16="http://schemas.microsoft.com/office/word/2018/wordml" xmlns:w16du="http://schemas.microsoft.com/office/word/2023/wordml/word16du" xmlns:w16sdtdh="http://schemas.microsoft.com/office/word/2020/wordml/sdtdatahash" xmlns:w16sdtfl="http://schemas.microsoft.com/office/word/2024/wordml/sdtformatlock" xmlns:w16se="http://schemas.microsoft.com/office/word/2015/wordml/symex" xmlns:wpg="http://schemas.microsoft.com/office/word/2010/wordprocessingGroup" xmlns:wpi="http://schemas.microsoft.com/office/word/2010/wordprocessingInk" xmlns:wne="http://schemas.microsoft.com/office/word/2006/wordml" xmlns:wps="http://schemas.microsoft.com/office/word/2010/wordprocessingShape" mc:Ignorable="w14 w15 w16se w16cid w16 w16cex w16sdtdh w16sdtfl w16du wp14">
+<w:ftr xmlns:wpc="http://schemas.microsoft.com/office/word/2010/wordprocessingCanvas" xmlns:cx="http://schemas.microsoft.com/office/drawing/2014/chartex" xmlns:cx1="http://schemas.microsoft.com/office/drawing/2015/9/8/chartex" xmlns:cx2="http://schemas.microsoft.com/office/drawing/2015/10/21/chartex" xmlns:cx3="http://schemas.microsoft.com/office/drawing/2016/5/9/chartex" xmlns:cx4="http://schemas.microsoft.com/office/drawing/2016/5/10/chartex" xmlns:cx5="http://schemas.microsoft.com/office/drawing/2016/5/11/chartex" xmlns:cx6="http://schemas.microsoft.com/office/drawing/2016/5/12/chartex" xmlns:cx7="http://schemas.microsoft.com/office/drawing/2016/5/13/chartex" xmlns:cx8="http://schemas.microsoft.com/office/drawing/2016/5/14/chartex" xmlns:mc="http://schemas.openxmlformats.org/markup-compatibility/2006" xmlns:m="http://schemas.openxmlformats.org/officeDocument/2006/math" xmlns:aink="http://schemas.microsoft.com/office/drawing/2016/ink" xmlns:am3d="http://schemas.microsoft.com/office/drawing/2017/model3d" xmlns:oel="http://schemas.microsoft.com/office/2019/extlst" xmlns:r="http://schemas.openxmlformats.org/officeDocument/2006/relationships" xmlns:wp14="http://schemas.microsoft.com/office/word/2010/wordprocessingDrawing" xmlns:wp="http://schemas.openxmlformats.org/drawingml/2006/wordprocessingDrawing" xmlns:wpg="http://schemas.microsoft.com/office/word/2010/wordprocessingGroup" xmlns:wpi="http://schemas.microsoft.com/office/word/2010/wordprocessingInk" xmlns:wps="http://schemas.microsoft.com/office/word/2010/wordprocessingShape" xmlns:o="urn:schemas-microsoft-com:office:office" xmlns:v="urn:schemas-microsoft-com:vml" xmlns:w10="urn:schemas-microsoft-com:office:word" xmlns:w="http://schemas.openxmlformats.org/wordprocessingml/2006/main" xmlns:w14="http://schemas.microsoft.com/office/word/2010/wordml" xmlns:w15="http://schemas.microsoft.com/office/word/2012/wordml" xmlns:w16cex="http://schemas.microsoft.com/office/word/2018/wordml/cex" xmlns:w16cid="http://schemas.microsoft.com/office/word/2016/wordml/cid" xmlns:w16="http://schemas.microsoft.com/office/word/2018/wordml" xmlns:w16sdtdh="http://schemas.microsoft.com/office/word/2020/wordml/sdtdatahash" xmlns:w16sdtfl="http://schemas.microsoft.com/office/word/2024/wordml/sdtformatlock" xmlns:w16se="http://schemas.microsoft.com/office/word/2015/wordml/symex" xmlns:w16du="http://schemas.microsoft.com/office/word/2023/wordml/word16du" xmlns:wne="http://schemas.microsoft.com/office/word/2006/wordml" mc:Ignorable="w14 w15 w16se w16cid w16 w16cex w16sdtdh w16sdtfl w16du wp14">
   <w:p>
     <w:pPr>
       <w:pStyle w:val="Footer"/>
@@ -4862,7 +4862,7 @@
 </file>
 
 <file path=word/footer3.xml><?xml version="1.0" encoding="utf-8"?>
-<w:ftr xmlns:wpc="http://schemas.microsoft.com/office/word/2010/wordprocessingCanvas" xmlns:cx="http://schemas.microsoft.com/office/drawing/2014/chartex" xmlns:cx1="http://schemas.microsoft.com/office/drawing/2015/9/8/chartex" xmlns:cx2="http://schemas.microsoft.com/office/drawing/2015/10/21/chartex" xmlns:cx3="http://schemas.microsoft.com/office/drawing/2016/5/9/chartex" xmlns:cx4="http://schemas.microsoft.com/office/drawing/2016/5/10/chartex" xmlns:cx5="http://schemas.microsoft.com/office/drawing/2016/5/11/chartex" xmlns:cx6="http://schemas.microsoft.com/office/drawing/2016/5/12/chartex" xmlns:cx7="http://schemas.microsoft.com/office/drawing/2016/5/13/chartex" xmlns:cx8="http://schemas.microsoft.com/office/drawing/2016/5/14/chartex" xmlns:mc="http://schemas.openxmlformats.org/markup-compatibility/2006" xmlns:aink="http://schemas.microsoft.com/office/drawing/2016/ink" xmlns:am3d="http://schemas.microsoft.com/office/drawing/2017/model3d" xmlns:o="urn:schemas-microsoft-com:office:office" xmlns:oel="http://schemas.microsoft.com/office/2019/extlst" xmlns:r="http://schemas.openxmlformats.org/officeDocument/2006/relationships" xmlns:m="http://schemas.openxmlformats.org/officeDocument/2006/math" xmlns:v="urn:schemas-microsoft-com:vml" xmlns:wp14="http://schemas.microsoft.com/office/word/2010/wordprocessingDrawing" xmlns:wp="http://schemas.openxmlformats.org/drawingml/2006/wordprocessingDrawing" xmlns:w10="urn:schemas-microsoft-com:office:word" xmlns:w="http://schemas.openxmlformats.org/wordprocessingml/2006/main" xmlns:w14="http://schemas.microsoft.com/office/word/2010/wordml" xmlns:w15="http://schemas.microsoft.com/office/word/2012/wordml" xmlns:w16cex="http://schemas.microsoft.com/office/word/2018/wordml/cex" xmlns:w16cid="http://schemas.microsoft.com/office/word/2016/wordml/cid" xmlns:w16="http://schemas.microsoft.com/office/word/2018/wordml" xmlns:w16du="http://schemas.microsoft.com/office/word/2023/wordml/word16du" xmlns:w16sdtdh="http://schemas.microsoft.com/office/word/2020/wordml/sdtdatahash" xmlns:w16sdtfl="http://schemas.microsoft.com/office/word/2024/wordml/sdtformatlock" xmlns:w16se="http://schemas.microsoft.com/office/word/2015/wordml/symex" xmlns:wpg="http://schemas.microsoft.com/office/word/2010/wordprocessingGroup" xmlns:wpi="http://schemas.microsoft.com/office/word/2010/wordprocessingInk" xmlns:wne="http://schemas.microsoft.com/office/word/2006/wordml" xmlns:wps="http://schemas.microsoft.com/office/word/2010/wordprocessingShape" mc:Ignorable="w14 w15 w16se w16cid w16 w16cex w16sdtdh w16sdtfl w16du wp14">
+<w:ftr xmlns:wpc="http://schemas.microsoft.com/office/word/2010/wordprocessingCanvas" xmlns:cx="http://schemas.microsoft.com/office/drawing/2014/chartex" xmlns:cx1="http://schemas.microsoft.com/office/drawing/2015/9/8/chartex" xmlns:cx2="http://schemas.microsoft.com/office/drawing/2015/10/21/chartex" xmlns:cx3="http://schemas.microsoft.com/office/drawing/2016/5/9/chartex" xmlns:cx4="http://schemas.microsoft.com/office/drawing/2016/5/10/chartex" xmlns:cx5="http://schemas.microsoft.com/office/drawing/2016/5/11/chartex" xmlns:cx6="http://schemas.microsoft.com/office/drawing/2016/5/12/chartex" xmlns:cx7="http://schemas.microsoft.com/office/drawing/2016/5/13/chartex" xmlns:cx8="http://schemas.microsoft.com/office/drawing/2016/5/14/chartex" xmlns:mc="http://schemas.openxmlformats.org/markup-compatibility/2006" xmlns:m="http://schemas.openxmlformats.org/officeDocument/2006/math" xmlns:aink="http://schemas.microsoft.com/office/drawing/2016/ink" xmlns:am3d="http://schemas.microsoft.com/office/drawing/2017/model3d" xmlns:oel="http://schemas.microsoft.com/office/2019/extlst" xmlns:r="http://schemas.openxmlformats.org/officeDocument/2006/relationships" xmlns:wp14="http://schemas.microsoft.com/office/word/2010/wordprocessingDrawing" xmlns:wp="http://schemas.openxmlformats.org/drawingml/2006/wordprocessingDrawing" xmlns:wpg="http://schemas.microsoft.com/office/word/2010/wordprocessingGroup" xmlns:wpi="http://schemas.microsoft.com/office/word/2010/wordprocessingInk" xmlns:wps="http://schemas.microsoft.com/office/word/2010/wordprocessingShape" xmlns:o="urn:schemas-microsoft-com:office:office" xmlns:v="urn:schemas-microsoft-com:vml" xmlns:w10="urn:schemas-microsoft-com:office:word" xmlns:w="http://schemas.openxmlformats.org/wordprocessingml/2006/main" xmlns:w14="http://schemas.microsoft.com/office/word/2010/wordml" xmlns:w15="http://schemas.microsoft.com/office/word/2012/wordml" xmlns:w16cex="http://schemas.microsoft.com/office/word/2018/wordml/cex" xmlns:w16cid="http://schemas.microsoft.com/office/word/2016/wordml/cid" xmlns:w16="http://schemas.microsoft.com/office/word/2018/wordml" xmlns:w16sdtdh="http://schemas.microsoft.com/office/word/2020/wordml/sdtdatahash" xmlns:w16sdtfl="http://schemas.microsoft.com/office/word/2024/wordml/sdtformatlock" xmlns:w16se="http://schemas.microsoft.com/office/word/2015/wordml/symex" xmlns:w16du="http://schemas.microsoft.com/office/word/2023/wordml/word16du" xmlns:wne="http://schemas.microsoft.com/office/word/2006/wordml" mc:Ignorable="w14 w15 w16se w16cid w16 w16cex w16sdtdh w16sdtfl w16du wp14">
   <w:p>
     <w:pPr>
       <w:pStyle w:val="Footer"/>
@@ -4872,7 +4872,7 @@
 </file>
 
 <file path=word/footnotes.xml><?xml version="1.0" encoding="utf-8"?>
-<w:footnotes xmlns:wpc="http://schemas.microsoft.com/office/word/2010/wordprocessingCanvas" xmlns:cx="http://schemas.microsoft.com/office/drawing/2014/chartex" xmlns:cx1="http://schemas.microsoft.com/office/drawing/2015/9/8/chartex" xmlns:cx2="http://schemas.microsoft.com/office/drawing/2015/10/21/chartex" xmlns:cx3="http://schemas.microsoft.com/office/drawing/2016/5/9/chartex" xmlns:cx4="http://schemas.microsoft.com/office/drawing/2016/5/10/chartex" xmlns:cx5="http://schemas.microsoft.com/office/drawing/2016/5/11/chartex" xmlns:cx6="http://schemas.microsoft.com/office/drawing/2016/5/12/chartex" xmlns:cx7="http://schemas.microsoft.com/office/drawing/2016/5/13/chartex" xmlns:cx8="http://schemas.microsoft.com/office/drawing/2016/5/14/chartex" xmlns:mc="http://schemas.openxmlformats.org/markup-compatibility/2006" xmlns:aink="http://schemas.microsoft.com/office/drawing/2016/ink" xmlns:am3d="http://schemas.microsoft.com/office/drawing/2017/model3d" xmlns:o="urn:schemas-microsoft-com:office:office" xmlns:oel="http://schemas.microsoft.com/office/2019/extlst" xmlns:r="http://schemas.openxmlformats.org/officeDocument/2006/relationships" xmlns:m="http://schemas.openxmlformats.org/officeDocument/2006/math" xmlns:v="urn:schemas-microsoft-com:vml" xmlns:wp14="http://schemas.microsoft.com/office/word/2010/wordprocessingDrawing" xmlns:wp="http://schemas.openxmlformats.org/drawingml/2006/wordprocessingDrawing" xmlns:w10="urn:schemas-microsoft-com:office:word" xmlns:w="http://schemas.openxmlformats.org/wordprocessingml/2006/main" xmlns:w14="http://schemas.microsoft.com/office/word/2010/wordml" xmlns:w15="http://schemas.microsoft.com/office/word/2012/wordml" xmlns:w16cex="http://schemas.microsoft.com/office/word/2018/wordml/cex" xmlns:w16cid="http://schemas.microsoft.com/office/word/2016/wordml/cid" xmlns:w16="http://schemas.microsoft.com/office/word/2018/wordml" xmlns:w16du="http://schemas.microsoft.com/office/word/2023/wordml/word16du" xmlns:w16sdtdh="http://schemas.microsoft.com/office/word/2020/wordml/sdtdatahash" xmlns:w16sdtfl="http://schemas.microsoft.com/office/word/2024/wordml/sdtformatlock" xmlns:w16se="http://schemas.microsoft.com/office/word/2015/wordml/symex" xmlns:wpg="http://schemas.microsoft.com/office/word/2010/wordprocessingGroup" xmlns:wpi="http://schemas.microsoft.com/office/word/2010/wordprocessingInk" xmlns:wne="http://schemas.microsoft.com/office/word/2006/wordml" xmlns:wps="http://schemas.microsoft.com/office/word/2010/wordprocessingShape" mc:Ignorable="w14 w15 w16se w16cid w16 w16cex w16sdtdh w16sdtfl w16du wp14">
+<w:footnotes xmlns:wpc="http://schemas.microsoft.com/office/word/2010/wordprocessingCanvas" xmlns:cx="http://schemas.microsoft.com/office/drawing/2014/chartex" xmlns:cx1="http://schemas.microsoft.com/office/drawing/2015/9/8/chartex" xmlns:cx2="http://schemas.microsoft.com/office/drawing/2015/10/21/chartex" xmlns:cx3="http://schemas.microsoft.com/office/drawing/2016/5/9/chartex" xmlns:cx4="http://schemas.microsoft.com/office/drawing/2016/5/10/chartex" xmlns:cx5="http://schemas.microsoft.com/office/drawing/2016/5/11/chartex" xmlns:cx6="http://schemas.microsoft.com/office/drawing/2016/5/12/chartex" xmlns:cx7="http://schemas.microsoft.com/office/drawing/2016/5/13/chartex" xmlns:cx8="http://schemas.microsoft.com/office/drawing/2016/5/14/chartex" xmlns:mc="http://schemas.openxmlformats.org/markup-compatibility/2006" xmlns:m="http://schemas.openxmlformats.org/officeDocument/2006/math" xmlns:aink="http://schemas.microsoft.com/office/drawing/2016/ink" xmlns:am3d="http://schemas.microsoft.com/office/drawing/2017/model3d" xmlns:oel="http://schemas.microsoft.com/office/2019/extlst" xmlns:r="http://schemas.openxmlformats.org/officeDocument/2006/relationships" xmlns:wp14="http://schemas.microsoft.com/office/word/2010/wordprocessingDrawing" xmlns:wp="http://schemas.openxmlformats.org/drawingml/2006/wordprocessingDrawing" xmlns:wpg="http://schemas.microsoft.com/office/word/2010/wordprocessingGroup" xmlns:wpi="http://schemas.microsoft.com/office/word/2010/wordprocessingInk" xmlns:wps="http://schemas.microsoft.com/office/word/2010/wordprocessingShape" xmlns:o="urn:schemas-microsoft-com:office:office" xmlns:v="urn:schemas-microsoft-com:vml" xmlns:w10="urn:schemas-microsoft-com:office:word" xmlns:w="http://schemas.openxmlformats.org/wordprocessingml/2006/main" xmlns:w14="http://schemas.microsoft.com/office/word/2010/wordml" xmlns:w15="http://schemas.microsoft.com/office/word/2012/wordml" xmlns:w16cex="http://schemas.microsoft.com/office/word/2018/wordml/cex" xmlns:w16cid="http://schemas.microsoft.com/office/word/2016/wordml/cid" xmlns:w16="http://schemas.microsoft.com/office/word/2018/wordml" xmlns:w16sdtdh="http://schemas.microsoft.com/office/word/2020/wordml/sdtdatahash" xmlns:w16sdtfl="http://schemas.microsoft.com/office/word/2024/wordml/sdtformatlock" xmlns:w16se="http://schemas.microsoft.com/office/word/2015/wordml/symex" xmlns:w16du="http://schemas.microsoft.com/office/word/2023/wordml/word16du" xmlns:wne="http://schemas.microsoft.com/office/word/2006/wordml" mc:Ignorable="w14 w15 w16se w16cid w16 w16cex w16sdtdh w16sdtfl w16du wp14">
   <w:footnote w:type="separator" w:id="-1">
     <w:p>
       <w:r>
@@ -4891,7 +4891,7 @@
 </file>
 
 <file path=word/header1.xml><?xml version="1.0" encoding="utf-8"?>
-<w:hdr xmlns:wpc="http://schemas.microsoft.com/office/word/2010/wordprocessingCanvas" xmlns:cx="http://schemas.microsoft.com/office/drawing/2014/chartex" xmlns:cx1="http://schemas.microsoft.com/office/drawing/2015/9/8/chartex" xmlns:cx2="http://schemas.microsoft.com/office/drawing/2015/10/21/chartex" xmlns:cx3="http://schemas.microsoft.com/office/drawing/2016/5/9/chartex" xmlns:cx4="http://schemas.microsoft.com/office/drawing/2016/5/10/chartex" xmlns:cx5="http://schemas.microsoft.com/office/drawing/2016/5/11/chartex" xmlns:cx6="http://schemas.microsoft.com/office/drawing/2016/5/12/chartex" xmlns:cx7="http://schemas.microsoft.com/office/drawing/2016/5/13/chartex" xmlns:cx8="http://schemas.microsoft.com/office/drawing/2016/5/14/chartex" xmlns:mc="http://schemas.openxmlformats.org/markup-compatibility/2006" xmlns:aink="http://schemas.microsoft.com/office/drawing/2016/ink" xmlns:am3d="http://schemas.microsoft.com/office/drawing/2017/model3d" xmlns:o="urn:schemas-microsoft-com:office:office" xmlns:oel="http://schemas.microsoft.com/office/2019/extlst" xmlns:r="http://schemas.openxmlformats.org/officeDocument/2006/relationships" xmlns:m="http://schemas.openxmlformats.org/officeDocument/2006/math" xmlns:v="urn:schemas-microsoft-com:vml" xmlns:wp14="http://schemas.microsoft.com/office/word/2010/wordprocessingDrawing" xmlns:wp="http://schemas.openxmlformats.org/drawingml/2006/wordprocessingDrawing" xmlns:w10="urn:schemas-microsoft-com:office:word" xmlns:w="http://schemas.openxmlformats.org/wordprocessingml/2006/main" xmlns:w14="http://schemas.microsoft.com/office/word/2010/wordml" xmlns:w15="http://schemas.microsoft.com/office/word/2012/wordml" xmlns:w16cex="http://schemas.microsoft.com/office/word/2018/wordml/cex" xmlns:w16cid="http://schemas.microsoft.com/office/word/2016/wordml/cid" xmlns:w16="http://schemas.microsoft.com/office/word/2018/wordml" xmlns:w16du="http://schemas.microsoft.com/office/word/2023/wordml/word16du" xmlns:w16sdtdh="http://schemas.microsoft.com/office/word/2020/wordml/sdtdatahash" xmlns:w16sdtfl="http://schemas.microsoft.com/office/word/2024/wordml/sdtformatlock" xmlns:w16se="http://schemas.microsoft.com/office/word/2015/wordml/symex" xmlns:wpg="http://schemas.microsoft.com/office/word/2010/wordprocessingGroup" xmlns:wpi="http://schemas.microsoft.com/office/word/2010/wordprocessingInk" xmlns:wne="http://schemas.microsoft.com/office/word/2006/wordml" xmlns:wps="http://schemas.microsoft.com/office/word/2010/wordprocessingShape" mc:Ignorable="w14 w15 w16se w16cid w16 w16cex w16sdtdh w16sdtfl w16du wp14">
+<w:hdr xmlns:wpc="http://schemas.microsoft.com/office/word/2010/wordprocessingCanvas" xmlns:cx="http://schemas.microsoft.com/office/drawing/2014/chartex" xmlns:cx1="http://schemas.microsoft.com/office/drawing/2015/9/8/chartex" xmlns:cx2="http://schemas.microsoft.com/office/drawing/2015/10/21/chartex" xmlns:cx3="http://schemas.microsoft.com/office/drawing/2016/5/9/chartex" xmlns:cx4="http://schemas.microsoft.com/office/drawing/2016/5/10/chartex" xmlns:cx5="http://schemas.microsoft.com/office/drawing/2016/5/11/chartex" xmlns:cx6="http://schemas.microsoft.com/office/drawing/2016/5/12/chartex" xmlns:cx7="http://schemas.microsoft.com/office/drawing/2016/5/13/chartex" xmlns:cx8="http://schemas.microsoft.com/office/drawing/2016/5/14/chartex" xmlns:mc="http://schemas.openxmlformats.org/markup-compatibility/2006" xmlns:m="http://schemas.openxmlformats.org/officeDocument/2006/math" xmlns:aink="http://schemas.microsoft.com/office/drawing/2016/ink" xmlns:am3d="http://schemas.microsoft.com/office/drawing/2017/model3d" xmlns:oel="http://schemas.microsoft.com/office/2019/extlst" xmlns:r="http://schemas.openxmlformats.org/officeDocument/2006/relationships" xmlns:wp14="http://schemas.microsoft.com/office/word/2010/wordprocessingDrawing" xmlns:wp="http://schemas.openxmlformats.org/drawingml/2006/wordprocessingDrawing" xmlns:wpg="http://schemas.microsoft.com/office/word/2010/wordprocessingGroup" xmlns:wpi="http://schemas.microsoft.com/office/word/2010/wordprocessingInk" xmlns:wps="http://schemas.microsoft.com/office/word/2010/wordprocessingShape" xmlns:o="urn:schemas-microsoft-com:office:office" xmlns:v="urn:schemas-microsoft-com:vml" xmlns:w10="urn:schemas-microsoft-com:office:word" xmlns:w="http://schemas.openxmlformats.org/wordprocessingml/2006/main" xmlns:w14="http://schemas.microsoft.com/office/word/2010/wordml" xmlns:w15="http://schemas.microsoft.com/office/word/2012/wordml" xmlns:w16cex="http://schemas.microsoft.com/office/word/2018/wordml/cex" xmlns:w16cid="http://schemas.microsoft.com/office/word/2016/wordml/cid" xmlns:w16="http://schemas.microsoft.com/office/word/2018/wordml" xmlns:w16sdtdh="http://schemas.microsoft.com/office/word/2020/wordml/sdtdatahash" xmlns:w16sdtfl="http://schemas.microsoft.com/office/word/2024/wordml/sdtformatlock" xmlns:w16se="http://schemas.microsoft.com/office/word/2015/wordml/symex" xmlns:w16du="http://schemas.microsoft.com/office/word/2023/wordml/word16du" xmlns:wne="http://schemas.microsoft.com/office/word/2006/wordml" mc:Ignorable="w14 w15 w16se w16cid w16 w16cex w16sdtdh w16sdtfl w16du wp14">
   <w:p>
     <w:pPr>
       <w:pStyle w:val="Header"/>
@@ -4901,7 +4901,7 @@
 </file>
 
 <file path=word/header2.xml><?xml version="1.0" encoding="utf-8"?>
-<w:hdr xmlns:wpc="http://schemas.microsoft.com/office/word/2010/wordprocessingCanvas" xmlns:cx="http://schemas.microsoft.com/office/drawing/2014/chartex" xmlns:cx1="http://schemas.microsoft.com/office/drawing/2015/9/8/chartex" xmlns:cx2="http://schemas.microsoft.com/office/drawing/2015/10/21/chartex" xmlns:cx3="http://schemas.microsoft.com/office/drawing/2016/5/9/chartex" xmlns:cx4="http://schemas.microsoft.com/office/drawing/2016/5/10/chartex" xmlns:cx5="http://schemas.microsoft.com/office/drawing/2016/5/11/chartex" xmlns:cx6="http://schemas.microsoft.com/office/drawing/2016/5/12/chartex" xmlns:cx7="http://schemas.microsoft.com/office/drawing/2016/5/13/chartex" xmlns:cx8="http://schemas.microsoft.com/office/drawing/2016/5/14/chartex" xmlns:mc="http://schemas.openxmlformats.org/markup-compatibility/2006" xmlns:aink="http://schemas.microsoft.com/office/drawing/2016/ink" xmlns:am3d="http://schemas.microsoft.com/office/drawing/2017/model3d" xmlns:o="urn:schemas-microsoft-com:office:office" xmlns:oel="http://schemas.microsoft.com/office/2019/extlst" xmlns:r="http://schemas.openxmlformats.org/officeDocument/2006/relationships" xmlns:m="http://schemas.openxmlformats.org/officeDocument/2006/math" xmlns:v="urn:schemas-microsoft-com:vml" xmlns:wp14="http://schemas.microsoft.com/office/word/2010/wordprocessingDrawing" xmlns:wp="http://schemas.openxmlformats.org/drawingml/2006/wordprocessingDrawing" xmlns:w10="urn:schemas-microsoft-com:office:word" xmlns:w="http://schemas.openxmlformats.org/wordprocessingml/2006/main" xmlns:w14="http://schemas.microsoft.com/office/word/2010/wordml" xmlns:w15="http://schemas.microsoft.com/office/word/2012/wordml" xmlns:w16cex="http://schemas.microsoft.com/office/word/2018/wordml/cex" xmlns:w16cid="http://schemas.microsoft.com/office/word/2016/wordml/cid" xmlns:w16="http://schemas.microsoft.com/office/word/2018/wordml" xmlns:w16du="http://schemas.microsoft.com/office/word/2023/wordml/word16du" xmlns:w16sdtdh="http://schemas.microsoft.com/office/word/2020/wordml/sdtdatahash" xmlns:w16sdtfl="http://schemas.microsoft.com/office/word/2024/wordml/sdtformatlock" xmlns:w16se="http://schemas.microsoft.com/office/word/2015/wordml/symex" xmlns:wpg="http://schemas.microsoft.com/office/word/2010/wordprocessingGroup" xmlns:wpi="http://schemas.microsoft.com/office/word/2010/wordprocessingInk" xmlns:wne="http://schemas.microsoft.com/office/word/2006/wordml" xmlns:wps="http://schemas.microsoft.com/office/word/2010/wordprocessingShape" mc:Ignorable="w14 w15 w16se w16cid w16 w16cex w16sdtdh w16sdtfl w16du wp14">
+<w:hdr xmlns:wpc="http://schemas.microsoft.com/office/word/2010/wordprocessingCanvas" xmlns:cx="http://schemas.microsoft.com/office/drawing/2014/chartex" xmlns:cx1="http://schemas.microsoft.com/office/drawing/2015/9/8/chartex" xmlns:cx2="http://schemas.microsoft.com/office/drawing/2015/10/21/chartex" xmlns:cx3="http://schemas.microsoft.com/office/drawing/2016/5/9/chartex" xmlns:cx4="http://schemas.microsoft.com/office/drawing/2016/5/10/chartex" xmlns:cx5="http://schemas.microsoft.com/office/drawing/2016/5/11/chartex" xmlns:cx6="http://schemas.microsoft.com/office/drawing/2016/5/12/chartex" xmlns:cx7="http://schemas.microsoft.com/office/drawing/2016/5/13/chartex" xmlns:cx8="http://schemas.microsoft.com/office/drawing/2016/5/14/chartex" xmlns:mc="http://schemas.openxmlformats.org/markup-compatibility/2006" xmlns:m="http://schemas.openxmlformats.org/officeDocument/2006/math" xmlns:aink="http://schemas.microsoft.com/office/drawing/2016/ink" xmlns:am3d="http://schemas.microsoft.com/office/drawing/2017/model3d" xmlns:oel="http://schemas.microsoft.com/office/2019/extlst" xmlns:r="http://schemas.openxmlformats.org/officeDocument/2006/relationships" xmlns:wp14="http://schemas.microsoft.com/office/word/2010/wordprocessingDrawing" xmlns:wp="http://schemas.openxmlformats.org/drawingml/2006/wordprocessingDrawing" xmlns:wpg="http://schemas.microsoft.com/office/word/2010/wordprocessingGroup" xmlns:wpi="http://schemas.microsoft.com/office/word/2010/wordprocessingInk" xmlns:wps="http://schemas.microsoft.com/office/word/2010/wordprocessingShape" xmlns:o="urn:schemas-microsoft-com:office:office" xmlns:v="urn:schemas-microsoft-com:vml" xmlns:w10="urn:schemas-microsoft-com:office:word" xmlns:w="http://schemas.openxmlformats.org/wordprocessingml/2006/main" xmlns:w14="http://schemas.microsoft.com/office/word/2010/wordml" xmlns:w15="http://schemas.microsoft.com/office/word/2012/wordml" xmlns:w16cex="http://schemas.microsoft.com/office/word/2018/wordml/cex" xmlns:w16cid="http://schemas.microsoft.com/office/word/2016/wordml/cid" xmlns:w16="http://schemas.microsoft.com/office/word/2018/wordml" xmlns:w16sdtdh="http://schemas.microsoft.com/office/word/2020/wordml/sdtdatahash" xmlns:w16sdtfl="http://schemas.microsoft.com/office/word/2024/wordml/sdtformatlock" xmlns:w16se="http://schemas.microsoft.com/office/word/2015/wordml/symex" xmlns:w16du="http://schemas.microsoft.com/office/word/2023/wordml/word16du" xmlns:wne="http://schemas.microsoft.com/office/word/2006/wordml" mc:Ignorable="w14 w15 w16se w16cid w16 w16cex w16sdtdh w16sdtfl w16du wp14">
   <w:p>
     <w:pPr>
       <w:pStyle w:val="Header"/>
@@ -4952,7 +4952,7 @@
 </file>
 
 <file path=word/header3.xml><?xml version="1.0" encoding="utf-8"?>
-<w:hdr xmlns:wpc="http://schemas.microsoft.com/office/word/2010/wordprocessingCanvas" xmlns:cx="http://schemas.microsoft.com/office/drawing/2014/chartex" xmlns:cx1="http://schemas.microsoft.com/office/drawing/2015/9/8/chartex" xmlns:cx2="http://schemas.microsoft.com/office/drawing/2015/10/21/chartex" xmlns:cx3="http://schemas.microsoft.com/office/drawing/2016/5/9/chartex" xmlns:cx4="http://schemas.microsoft.com/office/drawing/2016/5/10/chartex" xmlns:cx5="http://schemas.microsoft.com/office/drawing/2016/5/11/chartex" xmlns:cx6="http://schemas.microsoft.com/office/drawing/2016/5/12/chartex" xmlns:cx7="http://schemas.microsoft.com/office/drawing/2016/5/13/chartex" xmlns:cx8="http://schemas.microsoft.com/office/drawing/2016/5/14/chartex" xmlns:mc="http://schemas.openxmlformats.org/markup-compatibility/2006" xmlns:aink="http://schemas.microsoft.com/office/drawing/2016/ink" xmlns:am3d="http://schemas.microsoft.com/office/drawing/2017/model3d" xmlns:o="urn:schemas-microsoft-com:office:office" xmlns:oel="http://schemas.microsoft.com/office/2019/extlst" xmlns:r="http://schemas.openxmlformats.org/officeDocument/2006/relationships" xmlns:m="http://schemas.openxmlformats.org/officeDocument/2006/math" xmlns:v="urn:schemas-microsoft-com:vml" xmlns:wp14="http://schemas.microsoft.com/office/word/2010/wordprocessingDrawing" xmlns:wp="http://schemas.openxmlformats.org/drawingml/2006/wordprocessingDrawing" xmlns:w10="urn:schemas-microsoft-com:office:word" xmlns:w="http://schemas.openxmlformats.org/wordprocessingml/2006/main" xmlns:w14="http://schemas.microsoft.com/office/word/2010/wordml" xmlns:w15="http://schemas.microsoft.com/office/word/2012/wordml" xmlns:w16cex="http://schemas.microsoft.com/office/word/2018/wordml/cex" xmlns:w16cid="http://schemas.microsoft.com/office/word/2016/wordml/cid" xmlns:w16="http://schemas.microsoft.com/office/word/2018/wordml" xmlns:w16du="http://schemas.microsoft.com/office/word/2023/wordml/word16du" xmlns:w16sdtdh="http://schemas.microsoft.com/office/word/2020/wordml/sdtdatahash" xmlns:w16sdtfl="http://schemas.microsoft.com/office/word/2024/wordml/sdtformatlock" xmlns:w16se="http://schemas.microsoft.com/office/word/2015/wordml/symex" xmlns:wpg="http://schemas.microsoft.com/office/word/2010/wordprocessingGroup" xmlns:wpi="http://schemas.microsoft.com/office/word/2010/wordprocessingInk" xmlns:wne="http://schemas.microsoft.com/office/word/2006/wordml" xmlns:wps="http://schemas.microsoft.com/office/word/2010/wordprocessingShape" mc:Ignorable="w14 w15 w16se w16cid w16 w16cex w16sdtdh w16sdtfl w16du wp14">
+<w:hdr xmlns:wpc="http://schemas.microsoft.com/office/word/2010/wordprocessingCanvas" xmlns:cx="http://schemas.microsoft.com/office/drawing/2014/chartex" xmlns:cx1="http://schemas.microsoft.com/office/drawing/2015/9/8/chartex" xmlns:cx2="http://schemas.microsoft.com/office/drawing/2015/10/21/chartex" xmlns:cx3="http://schemas.microsoft.com/office/drawing/2016/5/9/chartex" xmlns:cx4="http://schemas.microsoft.com/office/drawing/2016/5/10/chartex" xmlns:cx5="http://schemas.microsoft.com/office/drawing/2016/5/11/chartex" xmlns:cx6="http://schemas.microsoft.com/office/drawing/2016/5/12/chartex" xmlns:cx7="http://schemas.microsoft.com/office/drawing/2016/5/13/chartex" xmlns:cx8="http://schemas.microsoft.com/office/drawing/2016/5/14/chartex" xmlns:mc="http://schemas.openxmlformats.org/markup-compatibility/2006" xmlns:m="http://schemas.openxmlformats.org/officeDocument/2006/math" xmlns:aink="http://schemas.microsoft.com/office/drawing/2016/ink" xmlns:am3d="http://schemas.microsoft.com/office/drawing/2017/model3d" xmlns:oel="http://schemas.microsoft.com/office/2019/extlst" xmlns:r="http://schemas.openxmlformats.org/officeDocument/2006/relationships" xmlns:wp14="http://schemas.microsoft.com/office/word/2010/wordprocessingDrawing" xmlns:wp="http://schemas.openxmlformats.org/drawingml/2006/wordprocessingDrawing" xmlns:wpg="http://schemas.microsoft.com/office/word/2010/wordprocessingGroup" xmlns:wpi="http://schemas.microsoft.com/office/word/2010/wordprocessingInk" xmlns:wps="http://schemas.microsoft.com/office/word/2010/wordprocessingShape" xmlns:o="urn:schemas-microsoft-com:office:office" xmlns:v="urn:schemas-microsoft-com:vml" xmlns:w10="urn:schemas-microsoft-com:office:word" xmlns:w="http://schemas.openxmlformats.org/wordprocessingml/2006/main" xmlns:w14="http://schemas.microsoft.com/office/word/2010/wordml" xmlns:w15="http://schemas.microsoft.com/office/word/2012/wordml" xmlns:w16cex="http://schemas.microsoft.com/office/word/2018/wordml/cex" xmlns:w16cid="http://schemas.microsoft.com/office/word/2016/wordml/cid" xmlns:w16="http://schemas.microsoft.com/office/word/2018/wordml" xmlns:w16sdtdh="http://schemas.microsoft.com/office/word/2020/wordml/sdtdatahash" xmlns:w16sdtfl="http://schemas.microsoft.com/office/word/2024/wordml/sdtformatlock" xmlns:w16se="http://schemas.microsoft.com/office/word/2015/wordml/symex" xmlns:w16du="http://schemas.microsoft.com/office/word/2023/wordml/word16du" xmlns:wne="http://schemas.microsoft.com/office/word/2006/wordml" mc:Ignorable="w14 w15 w16se w16cid w16 w16cex w16sdtdh w16sdtfl w16du wp14">
   <w:p>
     <w:pPr>
       <w:pStyle w:val="Header"/>
@@ -4962,7 +4962,7 @@
 </file>
 
 <file path=word/numbering.xml><?xml version="1.0" encoding="utf-8"?>
-<w:numbering xmlns:wpc="http://schemas.microsoft.com/office/word/2010/wordprocessingCanvas" xmlns:cx="http://schemas.microsoft.com/office/drawing/2014/chartex" xmlns:cx1="http://schemas.microsoft.com/office/drawing/2015/9/8/chartex" xmlns:cx2="http://schemas.microsoft.com/office/drawing/2015/10/21/chartex" xmlns:cx3="http://schemas.microsoft.com/office/drawing/2016/5/9/chartex" xmlns:cx4="http://schemas.microsoft.com/office/drawing/2016/5/10/chartex" xmlns:cx5="http://schemas.microsoft.com/office/drawing/2016/5/11/chartex" xmlns:cx6="http://schemas.microsoft.com/office/drawing/2016/5/12/chartex" xmlns:cx7="http://schemas.microsoft.com/office/drawing/2016/5/13/chartex" xmlns:cx8="http://schemas.microsoft.com/office/drawing/2016/5/14/chartex" xmlns:mc="http://schemas.openxmlformats.org/markup-compatibility/2006" xmlns:aink="http://schemas.microsoft.com/office/drawing/2016/ink" xmlns:am3d="http://schemas.microsoft.com/office/drawing/2017/model3d" xmlns:o="urn:schemas-microsoft-com:office:office" xmlns:oel="http://schemas.microsoft.com/office/2019/extlst" xmlns:r="http://schemas.openxmlformats.org/officeDocument/2006/relationships" xmlns:m="http://schemas.openxmlformats.org/officeDocument/2006/math" xmlns:v="urn:schemas-microsoft-com:vml" xmlns:wp14="http://schemas.microsoft.com/office/word/2010/wordprocessingDrawing" xmlns:wp="http://schemas.openxmlformats.org/drawingml/2006/wordprocessingDrawing" xmlns:w10="urn:schemas-microsoft-com:office:word" xmlns:w="http://schemas.openxmlformats.org/wordprocessingml/2006/main" xmlns:w14="http://schemas.microsoft.com/office/word/2010/wordml" xmlns:w15="http://schemas.microsoft.com/office/word/2012/wordml" xmlns:w16cex="http://schemas.microsoft.com/office/word/2018/wordml/cex" xmlns:w16cid="http://schemas.microsoft.com/office/word/2016/wordml/cid" xmlns:w16="http://schemas.microsoft.com/office/word/2018/wordml" xmlns:w16du="http://schemas.microsoft.com/office/word/2023/wordml/word16du" xmlns:w16sdtdh="http://schemas.microsoft.com/office/word/2020/wordml/sdtdatahash" xmlns:w16sdtfl="http://schemas.microsoft.com/office/word/2024/wordml/sdtformatlock" xmlns:w16se="http://schemas.microsoft.com/office/word/2015/wordml/symex" xmlns:wpg="http://schemas.microsoft.com/office/word/2010/wordprocessingGroup" xmlns:wpi="http://schemas.microsoft.com/office/word/2010/wordprocessingInk" xmlns:wne="http://schemas.microsoft.com/office/word/2006/wordml" xmlns:wps="http://schemas.microsoft.com/office/word/2010/wordprocessingShape" mc:Ignorable="w14 w15 w16se w16cid w16 w16cex w16sdtdh w16sdtfl w16du wp14">
+<w:numbering xmlns:wpc="http://schemas.microsoft.com/office/word/2010/wordprocessingCanvas" xmlns:cx="http://schemas.microsoft.com/office/drawing/2014/chartex" xmlns:cx1="http://schemas.microsoft.com/office/drawing/2015/9/8/chartex" xmlns:cx2="http://schemas.microsoft.com/office/drawing/2015/10/21/chartex" xmlns:cx3="http://schemas.microsoft.com/office/drawing/2016/5/9/chartex" xmlns:cx4="http://schemas.microsoft.com/office/drawing/2016/5/10/chartex" xmlns:cx5="http://schemas.microsoft.com/office/drawing/2016/5/11/chartex" xmlns:cx6="http://schemas.microsoft.com/office/drawing/2016/5/12/chartex" xmlns:cx7="http://schemas.microsoft.com/office/drawing/2016/5/13/chartex" xmlns:cx8="http://schemas.microsoft.com/office/drawing/2016/5/14/chartex" xmlns:mc="http://schemas.openxmlformats.org/markup-compatibility/2006" xmlns:m="http://schemas.openxmlformats.org/officeDocument/2006/math" xmlns:aink="http://schemas.microsoft.com/office/drawing/2016/ink" xmlns:am3d="http://schemas.microsoft.com/office/drawing/2017/model3d" xmlns:oel="http://schemas.microsoft.com/office/2019/extlst" xmlns:r="http://schemas.openxmlformats.org/officeDocument/2006/relationships" xmlns:wp14="http://schemas.microsoft.com/office/word/2010/wordprocessingDrawing" xmlns:wp="http://schemas.openxmlformats.org/drawingml/2006/wordprocessingDrawing" xmlns:wpg="http://schemas.microsoft.com/office/word/2010/wordprocessingGroup" xmlns:wpi="http://schemas.microsoft.com/office/word/2010/wordprocessingInk" xmlns:wps="http://schemas.microsoft.com/office/word/2010/wordprocessingShape" xmlns:o="urn:schemas-microsoft-com:office:office" xmlns:v="urn:schemas-microsoft-com:vml" xmlns:w10="urn:schemas-microsoft-com:office:word" xmlns:w="http://schemas.openxmlformats.org/wordprocessingml/2006/main" xmlns:w14="http://schemas.microsoft.com/office/word/2010/wordml" xmlns:w15="http://schemas.microsoft.com/office/word/2012/wordml" xmlns:w16cex="http://schemas.microsoft.com/office/word/2018/wordml/cex" xmlns:w16cid="http://schemas.microsoft.com/office/word/2016/wordml/cid" xmlns:w16="http://schemas.microsoft.com/office/word/2018/wordml" xmlns:w16sdtdh="http://schemas.microsoft.com/office/word/2020/wordml/sdtdatahash" xmlns:w16sdtfl="http://schemas.microsoft.com/office/word/2024/wordml/sdtformatlock" xmlns:w16se="http://schemas.microsoft.com/office/word/2015/wordml/symex" xmlns:w16du="http://schemas.microsoft.com/office/word/2023/wordml/word16du" xmlns:wne="http://schemas.microsoft.com/office/word/2006/wordml" mc:Ignorable="w14 w15 w16se w16cid w16 w16cex w16sdtdh w16sdtfl w16du wp14">
   <w:abstractNum w:abstractNumId="0" w15:restartNumberingAfterBreak="0">
     <w:nsid w:val="FFFFFF1D"/>
     <w:multiLevelType w:val="multilevel"/>
@@ -6426,7 +6426,7 @@
 </file>
 
 <file path=word/styles.xml><?xml version="1.0" encoding="utf-8"?>
-<w:styles xmlns:mc="http://schemas.openxmlformats.org/markup-compatibility/2006" xmlns:r="http://schemas.openxmlformats.org/officeDocument/2006/relationships" xmlns:w="http://schemas.openxmlformats.org/wordprocessingml/2006/main" xmlns:w14="http://schemas.microsoft.com/office/word/2010/wordml" xmlns:w15="http://schemas.microsoft.com/office/word/2012/wordml" xmlns:w16cex="http://schemas.microsoft.com/office/word/2018/wordml/cex" xmlns:w16cid="http://schemas.microsoft.com/office/word/2016/wordml/cid" xmlns:w16="http://schemas.microsoft.com/office/word/2018/wordml" xmlns:w16du="http://schemas.microsoft.com/office/word/2023/wordml/word16du" xmlns:w16sdtdh="http://schemas.microsoft.com/office/word/2020/wordml/sdtdatahash" xmlns:w16sdtfl="http://schemas.microsoft.com/office/word/2024/wordml/sdtformatlock" xmlns:w16se="http://schemas.microsoft.com/office/word/2015/wordml/symex" mc:Ignorable="w14 w15 w16se w16cid w16 w16cex w16sdtdh w16sdtfl w16du">
+<w:styles xmlns:mc="http://schemas.openxmlformats.org/markup-compatibility/2006" xmlns:r="http://schemas.openxmlformats.org/officeDocument/2006/relationships" xmlns:w="http://schemas.openxmlformats.org/wordprocessingml/2006/main" xmlns:w14="http://schemas.microsoft.com/office/word/2010/wordml" xmlns:w15="http://schemas.microsoft.com/office/word/2012/wordml" xmlns:w16cex="http://schemas.microsoft.com/office/word/2018/wordml/cex" xmlns:w16cid="http://schemas.microsoft.com/office/word/2016/wordml/cid" xmlns:w16="http://schemas.microsoft.com/office/word/2018/wordml" xmlns:w16sdtdh="http://schemas.microsoft.com/office/word/2020/wordml/sdtdatahash" xmlns:w16sdtfl="http://schemas.microsoft.com/office/word/2024/wordml/sdtformatlock" xmlns:w16se="http://schemas.microsoft.com/office/word/2015/wordml/symex" xmlns:w16du="http://schemas.microsoft.com/office/word/2023/wordml/word16du" mc:Ignorable="w14 w15 w16se w16cid w16 w16cex w16sdtdh w16sdtfl w16du">
   <w:docDefaults>
     <w:rPrDefault>
       <w:rPr>

</xml_diff>